<commit_message>
Final: new test predictions + fix v8 composition (26 members)
- predict_new_test.py: inference on new test file, handles xx:59:59 timestamps
- predictions_new_test.csv / predictions.csv: 1152 rows, 2026-04-01..2026-05-18
- README.md: correct v8 composition (LGBM x15, DART x3, XGB x3, CB x5 = 26)
- report.docx: updated with correct ensemble table

Co-Authored-By: Claude Sonnet 4.6 <noreply@anthropic.com>
</commit_message>
<xml_diff>
--- a/report.docx
+++ b/report.docx
@@ -149,7 +149,7 @@
           <w:i w:val="0"/>
           <w:sz w:val="24"/>
         </w:rPr>
-        <w:t>Решение построено на гомогенном LightGBM-ансамбле с гиперпараметрами, подобранными алгоритмом Optuna. Ключевые принципы:</w:t>
+        <w:t>Решение построено на гетерогенном ансамбле градиентного бустинга с гиперпараметрами, подобранными алгоритмом Optuna. Ключевые принципы:</w:t>
       </w:r>
     </w:p>
     <w:p>
@@ -201,7 +201,7 @@
           <w:rFonts w:ascii="Times New Roman" w:hAnsi="Times New Roman"/>
           <w:sz w:val="24"/>
         </w:rPr>
-        <w:t>Ансамбль из 15 членов LightGBM GBDT (5 конфигураций × 3 seed) — diversity по начальным условиям снижает дисперсию прогноза.</w:t>
+        <w:t>Гетерогенный ансамбль из 26 членов (LGBM GBDT×15, DART×3, XGBoost×3, CatBoost×5) — разные архитектуры снижают корреляцию ошибок.</w:t>
       </w:r>
     </w:p>
     <w:p>
@@ -269,7 +269,7 @@
           <w:i w:val="0"/>
           <w:sz w:val="24"/>
         </w:rPr>
-        <w:t>Итоговая модель — ансамбль из 15 членов LightGBM GBDT:</w:t>
+        <w:t>Итоговая модель (v8) — гетерогенный ансамбль из 26 членов:</w:t>
       </w:r>
     </w:p>
     <w:tbl>
@@ -369,7 +369,139 @@
                 <w:rFonts w:ascii="Times New Roman" w:hAnsi="Times New Roman"/>
                 <w:sz w:val="22"/>
               </w:rPr>
-              <w:t>5 лучших Optuna-конфигураций × 3 seed</w:t>
+              <w:t>5 Optuna-конфигураций × 3 seed</w:t>
+            </w:r>
+          </w:p>
+        </w:tc>
+      </w:tr>
+      <w:tr>
+        <w:tc>
+          <w:tcPr>
+            <w:tcW w:type="dxa" w:w="3230"/>
+          </w:tcPr>
+          <w:p>
+            <w:r>
+              <w:rPr>
+                <w:rFonts w:ascii="Times New Roman" w:hAnsi="Times New Roman"/>
+                <w:sz w:val="22"/>
+              </w:rPr>
+              <w:t>LightGBM DART</w:t>
+            </w:r>
+          </w:p>
+        </w:tc>
+        <w:tc>
+          <w:tcPr>
+            <w:tcW w:type="dxa" w:w="3230"/>
+          </w:tcPr>
+          <w:p>
+            <w:r>
+              <w:rPr>
+                <w:rFonts w:ascii="Times New Roman" w:hAnsi="Times New Roman"/>
+                <w:sz w:val="22"/>
+              </w:rPr>
+              <w:t>3</w:t>
+            </w:r>
+          </w:p>
+        </w:tc>
+        <w:tc>
+          <w:tcPr>
+            <w:tcW w:type="dxa" w:w="3230"/>
+          </w:tcPr>
+          <w:p>
+            <w:r>
+              <w:rPr>
+                <w:rFonts w:ascii="Times New Roman" w:hAnsi="Times New Roman"/>
+                <w:sz w:val="22"/>
+              </w:rPr>
+              <w:t>num_leaves ∈ {80, 100, 150}</w:t>
+            </w:r>
+          </w:p>
+        </w:tc>
+      </w:tr>
+      <w:tr>
+        <w:tc>
+          <w:tcPr>
+            <w:tcW w:type="dxa" w:w="3230"/>
+          </w:tcPr>
+          <w:p>
+            <w:r>
+              <w:rPr>
+                <w:rFonts w:ascii="Times New Roman" w:hAnsi="Times New Roman"/>
+                <w:sz w:val="22"/>
+              </w:rPr>
+              <w:t>XGBoost</w:t>
+            </w:r>
+          </w:p>
+        </w:tc>
+        <w:tc>
+          <w:tcPr>
+            <w:tcW w:type="dxa" w:w="3230"/>
+          </w:tcPr>
+          <w:p>
+            <w:r>
+              <w:rPr>
+                <w:rFonts w:ascii="Times New Roman" w:hAnsi="Times New Roman"/>
+                <w:sz w:val="22"/>
+              </w:rPr>
+              <w:t>3</w:t>
+            </w:r>
+          </w:p>
+        </w:tc>
+        <w:tc>
+          <w:tcPr>
+            <w:tcW w:type="dxa" w:w="3230"/>
+          </w:tcPr>
+          <w:p>
+            <w:r>
+              <w:rPr>
+                <w:rFonts w:ascii="Times New Roman" w:hAnsi="Times New Roman"/>
+                <w:sz w:val="22"/>
+              </w:rPr>
+              <w:t>depth ∈ {6, 7, 8}</w:t>
+            </w:r>
+          </w:p>
+        </w:tc>
+      </w:tr>
+      <w:tr>
+        <w:tc>
+          <w:tcPr>
+            <w:tcW w:type="dxa" w:w="3230"/>
+          </w:tcPr>
+          <w:p>
+            <w:r>
+              <w:rPr>
+                <w:rFonts w:ascii="Times New Roman" w:hAnsi="Times New Roman"/>
+                <w:sz w:val="22"/>
+              </w:rPr>
+              <w:t>CatBoost</w:t>
+            </w:r>
+          </w:p>
+        </w:tc>
+        <w:tc>
+          <w:tcPr>
+            <w:tcW w:type="dxa" w:w="3230"/>
+          </w:tcPr>
+          <w:p>
+            <w:r>
+              <w:rPr>
+                <w:rFonts w:ascii="Times New Roman" w:hAnsi="Times New Roman"/>
+                <w:sz w:val="22"/>
+              </w:rPr>
+              <w:t>5</w:t>
+            </w:r>
+          </w:p>
+        </w:tc>
+        <w:tc>
+          <w:tcPr>
+            <w:tcW w:type="dxa" w:w="3230"/>
+          </w:tcPr>
+          <w:p>
+            <w:r>
+              <w:rPr>
+                <w:rFonts w:ascii="Times New Roman" w:hAnsi="Times New Roman"/>
+                <w:sz w:val="22"/>
+              </w:rPr>
+              <w:t>depth ∈ {7–11}, консервативный LR</w:t>
             </w:r>
           </w:p>
         </w:tc>

</xml_diff>